<commit_message>
Class notes from Monday
</commit_message>
<xml_diff>
--- a/In Class Worksheet/Worksheet4_Bayesian_2026.docx
+++ b/In Class Worksheet/Worksheet4_Bayesian_2026.docx
@@ -4932,11 +4932,83 @@
         <w:ind w:left="1080"/>
         <w:rPr>
           <w:rFonts w:ascii="Arial" w:hAnsi="Arial" w:cs="Arial"/>
-          <w:color w:val="000000"/>
+          <w:color w:val="4F81BD" w:themeColor="accent1"/>
           <w:sz w:val="24"/>
           <w:szCs w:val="24"/>
         </w:rPr>
       </w:pPr>
+      <w:r>
+        <w:rPr>
+          <w:rFonts w:ascii="Arial" w:hAnsi="Arial" w:cs="Arial"/>
+          <w:color w:val="4F81BD" w:themeColor="accent1"/>
+          <w:sz w:val="24"/>
+          <w:szCs w:val="24"/>
+        </w:rPr>
+        <w:t>R</w:t>
+      </w:r>
+      <w:r>
+        <w:rPr>
+          <w:rFonts w:ascii="Arial" w:hAnsi="Arial" w:cs="Arial"/>
+          <w:color w:val="4F81BD" w:themeColor="accent1"/>
+          <w:sz w:val="24"/>
+          <w:szCs w:val="24"/>
+        </w:rPr>
+        <w:t>emoving capsular penetration from the full model results in essentially no change in model fit</w:t>
+      </w:r>
+      <w:r>
+        <w:rPr>
+          <w:rFonts w:ascii="Arial" w:hAnsi="Arial" w:cs="Arial"/>
+          <w:color w:val="4F81BD" w:themeColor="accent1"/>
+          <w:sz w:val="24"/>
+          <w:szCs w:val="24"/>
+        </w:rPr>
+        <w:t>, suggesting that capsular penetration is not needed in the full model. I</w:t>
+      </w:r>
+      <w:r>
+        <w:rPr>
+          <w:rFonts w:ascii="Arial" w:hAnsi="Arial" w:cs="Arial"/>
+          <w:color w:val="4F81BD" w:themeColor="accent1"/>
+          <w:sz w:val="24"/>
+          <w:szCs w:val="24"/>
+        </w:rPr>
+        <w:t xml:space="preserve">n the </w:t>
+      </w:r>
+      <w:r>
+        <w:rPr>
+          <w:rFonts w:ascii="Arial" w:hAnsi="Arial" w:cs="Arial"/>
+          <w:color w:val="4F81BD" w:themeColor="accent1"/>
+          <w:sz w:val="24"/>
+          <w:szCs w:val="24"/>
+        </w:rPr>
+        <w:t>model with only capsular penetration</w:t>
+      </w:r>
+      <w:r>
+        <w:rPr>
+          <w:rFonts w:ascii="Arial" w:hAnsi="Arial" w:cs="Arial"/>
+          <w:color w:val="4F81BD" w:themeColor="accent1"/>
+          <w:sz w:val="24"/>
+          <w:szCs w:val="24"/>
+        </w:rPr>
+        <w:t xml:space="preserve"> the HPDI does not include zero and model fit is substantially better than the intercept-only model, indicating </w:t>
+      </w:r>
+      <w:r>
+        <w:rPr>
+          <w:rFonts w:ascii="Arial" w:hAnsi="Arial" w:cs="Arial"/>
+          <w:color w:val="4F81BD" w:themeColor="accent1"/>
+          <w:sz w:val="24"/>
+          <w:szCs w:val="24"/>
+        </w:rPr>
+        <w:t>capsular penetration</w:t>
+      </w:r>
+      <w:r>
+        <w:rPr>
+          <w:rFonts w:ascii="Arial" w:hAnsi="Arial" w:cs="Arial"/>
+          <w:color w:val="4F81BD" w:themeColor="accent1"/>
+          <w:sz w:val="24"/>
+          <w:szCs w:val="24"/>
+        </w:rPr>
+        <w:t xml:space="preserve"> is a meaningful predictor of Log PSA when considered alone.</w:t>
+      </w:r>
     </w:p>
     <w:p>
       <w:pPr>
@@ -4958,24 +5030,6 @@
           <w:szCs w:val="24"/>
         </w:rPr>
       </w:pPr>
-      <w:r>
-        <w:rPr>
-          <w:rFonts w:ascii="Arial" w:hAnsi="Arial" w:cs="Arial"/>
-          <w:color w:val="4F81BD" w:themeColor="accent1"/>
-          <w:sz w:val="24"/>
-          <w:szCs w:val="24"/>
-        </w:rPr>
-        <w:t xml:space="preserve">It doesn’t appear to be needed in the </w:t>
-      </w:r>
-      <w:r>
-        <w:rPr>
-          <w:rFonts w:ascii="Arial" w:hAnsi="Arial" w:cs="Arial"/>
-          <w:color w:val="4F81BD" w:themeColor="accent1"/>
-          <w:sz w:val="24"/>
-          <w:szCs w:val="24"/>
-        </w:rPr>
-        <w:t>full model but does not appear necessary in the crude model.</w:t>
-      </w:r>
     </w:p>
     <w:p>
       <w:pPr>
@@ -11656,6 +11710,7 @@
                       <w:sz w:val="20"/>
                       <w:szCs w:val="20"/>
                     </w:rPr>
+                    <w:lastRenderedPageBreak/>
                     <w:t>&lt;.0001</w:t>
                   </w:r>
                 </w:p>
@@ -11747,6 +11802,7 @@
                       <w:sz w:val="20"/>
                       <w:szCs w:val="20"/>
                     </w:rPr>
+                    <w:lastRenderedPageBreak/>
                     <w:t>0.51689</w:t>
                   </w:r>
                 </w:p>
@@ -11791,6 +11847,7 @@
                       <w:sz w:val="20"/>
                       <w:szCs w:val="20"/>
                     </w:rPr>
+                    <w:lastRenderedPageBreak/>
                     <w:t>&lt;.0001</w:t>
                   </w:r>
                 </w:p>
@@ -11882,6 +11939,7 @@
                       <w:sz w:val="20"/>
                       <w:szCs w:val="20"/>
                     </w:rPr>
+                    <w:lastRenderedPageBreak/>
                     <w:t>0.69155</w:t>
                   </w:r>
                 </w:p>
@@ -11926,6 +11984,7 @@
                       <w:sz w:val="20"/>
                       <w:szCs w:val="20"/>
                     </w:rPr>
+                    <w:lastRenderedPageBreak/>
                     <w:t>&lt;.0001</w:t>
                   </w:r>
                 </w:p>
@@ -12017,6 +12076,7 @@
                       <w:sz w:val="20"/>
                       <w:szCs w:val="20"/>
                     </w:rPr>
+                    <w:lastRenderedPageBreak/>
                     <w:t>0.13661</w:t>
                   </w:r>
                 </w:p>
@@ -12061,6 +12121,7 @@
                       <w:sz w:val="20"/>
                       <w:szCs w:val="20"/>
                     </w:rPr>
+                    <w:lastRenderedPageBreak/>
                     <w:t>0.1844</w:t>
                   </w:r>
                 </w:p>
@@ -12152,6 +12213,7 @@
                       <w:sz w:val="20"/>
                       <w:szCs w:val="20"/>
                     </w:rPr>
+                    <w:lastRenderedPageBreak/>
                     <w:t>0.10071</w:t>
                   </w:r>
                 </w:p>
@@ -12196,6 +12258,7 @@
                       <w:sz w:val="20"/>
                       <w:szCs w:val="20"/>
                     </w:rPr>
+                    <w:lastRenderedPageBreak/>
                     <w:t>0.3289</w:t>
                   </w:r>
                 </w:p>
@@ -12288,6 +12351,7 @@
                       <w:sz w:val="20"/>
                       <w:szCs w:val="20"/>
                     </w:rPr>
+                    <w:lastRenderedPageBreak/>
                     <w:t>-0.07748</w:t>
                   </w:r>
                 </w:p>
@@ -12332,6 +12396,7 @@
                       <w:sz w:val="20"/>
                       <w:szCs w:val="20"/>
                     </w:rPr>
+                    <w:lastRenderedPageBreak/>
                     <w:t>0.4531</w:t>
                   </w:r>
                 </w:p>
@@ -12423,6 +12488,7 @@
                       <w:sz w:val="20"/>
                       <w:szCs w:val="20"/>
                     </w:rPr>
+                    <w:lastRenderedPageBreak/>
                     <w:t>1.00000</w:t>
                   </w:r>
                 </w:p>
@@ -12467,6 +12533,7 @@
                       <w:sz w:val="20"/>
                       <w:szCs w:val="20"/>
                     </w:rPr>
+                    <w:lastRenderedPageBreak/>
                     <w:t> </w:t>
                   </w:r>
                 </w:p>
@@ -12502,11 +12569,80 @@
         <w:ind w:left="1080"/>
         <w:rPr>
           <w:rFonts w:ascii="Arial" w:hAnsi="Arial" w:cs="Arial"/>
-          <w:color w:val="000000"/>
+          <w:color w:val="4F81BD" w:themeColor="accent1"/>
           <w:sz w:val="24"/>
           <w:szCs w:val="24"/>
         </w:rPr>
       </w:pPr>
+    </w:p>
+    <w:p>
+      <w:pPr>
+        <w:pStyle w:val="ListParagraph"/>
+        <w:widowControl w:val="0"/>
+        <w:tabs>
+          <w:tab w:val="left" w:pos="220"/>
+          <w:tab w:val="left" w:pos="720"/>
+        </w:tabs>
+        <w:autoSpaceDE w:val="0"/>
+        <w:autoSpaceDN w:val="0"/>
+        <w:adjustRightInd w:val="0"/>
+        <w:spacing w:after="293" w:line="340" w:lineRule="atLeast"/>
+        <w:ind w:left="1080"/>
+        <w:rPr>
+          <w:rFonts w:ascii="Arial" w:hAnsi="Arial" w:cs="Arial"/>
+          <w:color w:val="4F81BD" w:themeColor="accent1"/>
+          <w:sz w:val="24"/>
+          <w:szCs w:val="24"/>
+        </w:rPr>
+      </w:pPr>
+    </w:p>
+    <w:p>
+      <w:pPr>
+        <w:pStyle w:val="ListParagraph"/>
+        <w:widowControl w:val="0"/>
+        <w:tabs>
+          <w:tab w:val="left" w:pos="220"/>
+          <w:tab w:val="left" w:pos="720"/>
+        </w:tabs>
+        <w:autoSpaceDE w:val="0"/>
+        <w:autoSpaceDN w:val="0"/>
+        <w:adjustRightInd w:val="0"/>
+        <w:spacing w:after="293" w:line="340" w:lineRule="atLeast"/>
+        <w:ind w:left="1080"/>
+        <w:rPr>
+          <w:rFonts w:ascii="Arial" w:hAnsi="Arial" w:cs="Arial"/>
+          <w:color w:val="4F81BD" w:themeColor="accent1"/>
+          <w:sz w:val="24"/>
+          <w:szCs w:val="24"/>
+        </w:rPr>
+      </w:pPr>
+      <w:r>
+        <w:rPr>
+          <w:rFonts w:ascii="Arial" w:hAnsi="Arial" w:cs="Arial"/>
+          <w:color w:val="4F81BD" w:themeColor="accent1"/>
+          <w:sz w:val="24"/>
+          <w:szCs w:val="24"/>
+        </w:rPr>
+        <w:t>Capsular penetration has a strong positive correlation with both Log PSA (r = 0.517, p &lt; .0001) and cancer volume (CAVOL) (r = 0.692, p &lt; .0001).</w:t>
+      </w:r>
+      <w:r>
+        <w:rPr>
+          <w:rFonts w:ascii="Arial" w:hAnsi="Arial" w:cs="Arial"/>
+          <w:color w:val="4F81BD" w:themeColor="accent1"/>
+          <w:sz w:val="24"/>
+          <w:szCs w:val="24"/>
+        </w:rPr>
+        <w:t xml:space="preserve"> </w:t>
+      </w:r>
+      <w:r>
+        <w:rPr>
+          <w:rFonts w:ascii="Arial" w:hAnsi="Arial" w:cs="Arial"/>
+          <w:color w:val="4F81BD" w:themeColor="accent1"/>
+          <w:sz w:val="24"/>
+          <w:szCs w:val="24"/>
+        </w:rPr>
+        <w:t>Cancer volume is also strongly correlated with Log PSA (r = 0.656, p &lt; .0001). Prostate weight, age, and BPH show weaker or non-significant correlations with Log PSA.</w:t>
+      </w:r>
     </w:p>
     <w:p>
       <w:pPr>
@@ -12593,49 +12729,74 @@
         <w:spacing w:after="293" w:line="340" w:lineRule="atLeast"/>
         <w:rPr>
           <w:rFonts w:ascii="Arial" w:hAnsi="Arial" w:cs="Arial"/>
-          <w:color w:val="000000"/>
+          <w:color w:val="4F81BD" w:themeColor="accent1"/>
           <w:sz w:val="24"/>
           <w:szCs w:val="24"/>
         </w:rPr>
       </w:pPr>
-    </w:p>
-    <w:p>
-      <w:pPr>
-        <w:widowControl w:val="0"/>
-        <w:tabs>
-          <w:tab w:val="left" w:pos="220"/>
-          <w:tab w:val="left" w:pos="720"/>
-        </w:tabs>
-        <w:autoSpaceDE w:val="0"/>
-        <w:autoSpaceDN w:val="0"/>
-        <w:adjustRightInd w:val="0"/>
-        <w:spacing w:after="293" w:line="340" w:lineRule="atLeast"/>
-        <w:rPr>
-          <w:rFonts w:ascii="Arial" w:hAnsi="Arial" w:cs="Arial"/>
-          <w:color w:val="000000"/>
-          <w:sz w:val="24"/>
-          <w:szCs w:val="24"/>
-        </w:rPr>
-      </w:pPr>
-    </w:p>
-    <w:p>
-      <w:pPr>
-        <w:widowControl w:val="0"/>
-        <w:tabs>
-          <w:tab w:val="left" w:pos="220"/>
-          <w:tab w:val="left" w:pos="720"/>
-        </w:tabs>
-        <w:autoSpaceDE w:val="0"/>
-        <w:autoSpaceDN w:val="0"/>
-        <w:adjustRightInd w:val="0"/>
-        <w:spacing w:after="293" w:line="340" w:lineRule="atLeast"/>
-        <w:rPr>
-          <w:rFonts w:ascii="Arial" w:hAnsi="Arial" w:cs="Arial"/>
-          <w:color w:val="000000"/>
-          <w:sz w:val="24"/>
-          <w:szCs w:val="24"/>
-        </w:rPr>
-      </w:pPr>
+      <w:r>
+        <w:rPr>
+          <w:rFonts w:ascii="Arial" w:hAnsi="Arial" w:cs="Arial"/>
+          <w:color w:val="4F81BD" w:themeColor="accent1"/>
+          <w:sz w:val="24"/>
+          <w:szCs w:val="24"/>
+        </w:rPr>
+        <w:t>Cancer volume</w:t>
+      </w:r>
+      <w:r>
+        <w:rPr>
+          <w:rFonts w:ascii="Arial" w:hAnsi="Arial" w:cs="Arial"/>
+          <w:color w:val="4F81BD" w:themeColor="accent1"/>
+          <w:sz w:val="24"/>
+          <w:szCs w:val="24"/>
+        </w:rPr>
+        <w:t xml:space="preserve"> </w:t>
+      </w:r>
+      <w:r>
+        <w:rPr>
+          <w:rFonts w:ascii="Arial" w:hAnsi="Arial" w:cs="Arial"/>
+          <w:color w:val="4F81BD" w:themeColor="accent1"/>
+          <w:sz w:val="24"/>
+          <w:szCs w:val="24"/>
+        </w:rPr>
+        <w:t xml:space="preserve">is  acting as a potential confounder or collinear variable with capsular penetration. </w:t>
+      </w:r>
+      <w:r>
+        <w:rPr>
+          <w:rFonts w:ascii="Arial" w:hAnsi="Arial" w:cs="Arial"/>
+          <w:color w:val="4F81BD" w:themeColor="accent1"/>
+          <w:sz w:val="24"/>
+          <w:szCs w:val="24"/>
+        </w:rPr>
+        <w:t>They</w:t>
+      </w:r>
+      <w:r>
+        <w:rPr>
+          <w:rFonts w:ascii="Arial" w:hAnsi="Arial" w:cs="Arial"/>
+          <w:color w:val="4F81BD" w:themeColor="accent1"/>
+          <w:sz w:val="24"/>
+          <w:szCs w:val="24"/>
+        </w:rPr>
+        <w:t xml:space="preserve"> are highly correlated (r = 0.692), and both are associated with Log PSA</w:t>
+      </w:r>
+      <w:r>
+        <w:rPr>
+          <w:rFonts w:ascii="Arial" w:hAnsi="Arial" w:cs="Arial"/>
+          <w:color w:val="4F81BD" w:themeColor="accent1"/>
+          <w:sz w:val="24"/>
+          <w:szCs w:val="24"/>
+        </w:rPr>
+        <w:t>. This</w:t>
+      </w:r>
+      <w:r>
+        <w:rPr>
+          <w:rFonts w:ascii="Arial" w:hAnsi="Arial" w:cs="Arial"/>
+          <w:color w:val="4F81BD" w:themeColor="accent1"/>
+          <w:sz w:val="24"/>
+          <w:szCs w:val="24"/>
+        </w:rPr>
+        <w:t xml:space="preserve"> explains why the CAPPEN coefficient drops dramatically (from 0.16 to -0.025) when CAVOL is included in the full model.</w:t>
+      </w:r>
     </w:p>
     <w:p>
       <w:pPr>
@@ -12736,6 +12897,199 @@
           <w:szCs w:val="24"/>
         </w:rPr>
       </w:pPr>
+      <w:r>
+        <w:rPr>
+          <w:rFonts w:ascii="Arial" w:hAnsi="Arial" w:cs="Arial"/>
+          <w:b/>
+          <w:bCs/>
+          <w:noProof/>
+          <w:color w:val="000000"/>
+          <w:sz w:val="24"/>
+          <w:szCs w:val="24"/>
+        </w:rPr>
+        <mc:AlternateContent>
+          <mc:Choice Requires="wps">
+            <w:drawing>
+              <wp:anchor distT="0" distB="0" distL="114300" distR="114300" simplePos="0" relativeHeight="251661312" behindDoc="0" locked="0" layoutInCell="1" allowOverlap="1" wp14:anchorId="13023702" wp14:editId="3D424150">
+                <wp:simplePos x="0" y="0"/>
+                <wp:positionH relativeFrom="column">
+                  <wp:posOffset>2125980</wp:posOffset>
+                </wp:positionH>
+                <wp:positionV relativeFrom="paragraph">
+                  <wp:posOffset>165735</wp:posOffset>
+                </wp:positionV>
+                <wp:extent cx="426720" cy="236220"/>
+                <wp:effectExtent l="0" t="0" r="68580" b="49530"/>
+                <wp:wrapNone/>
+                <wp:docPr id="1217261229" name="Straight Arrow Connector 3"/>
+                <wp:cNvGraphicFramePr/>
+                <a:graphic xmlns:a="http://schemas.openxmlformats.org/drawingml/2006/main">
+                  <a:graphicData uri="http://schemas.microsoft.com/office/word/2010/wordprocessingShape">
+                    <wps:wsp>
+                      <wps:cNvCnPr/>
+                      <wps:spPr>
+                        <a:xfrm>
+                          <a:off x="0" y="0"/>
+                          <a:ext cx="426720" cy="236220"/>
+                        </a:xfrm>
+                        <a:prstGeom prst="straightConnector1">
+                          <a:avLst/>
+                        </a:prstGeom>
+                        <a:ln>
+                          <a:tailEnd type="triangle"/>
+                        </a:ln>
+                      </wps:spPr>
+                      <wps:style>
+                        <a:lnRef idx="1">
+                          <a:schemeClr val="accent1"/>
+                        </a:lnRef>
+                        <a:fillRef idx="0">
+                          <a:schemeClr val="accent1"/>
+                        </a:fillRef>
+                        <a:effectRef idx="0">
+                          <a:schemeClr val="accent1"/>
+                        </a:effectRef>
+                        <a:fontRef idx="minor">
+                          <a:schemeClr val="tx1"/>
+                        </a:fontRef>
+                      </wps:style>
+                      <wps:bodyPr/>
+                    </wps:wsp>
+                  </a:graphicData>
+                </a:graphic>
+              </wp:anchor>
+            </w:drawing>
+          </mc:Choice>
+          <mc:Fallback>
+            <w:pict>
+              <v:shapetype w14:anchorId="7CF22FB3" id="_x0000_t32" coordsize="21600,21600" o:spt="32" o:oned="t" path="m,l21600,21600e" filled="f">
+                <v:path arrowok="t" fillok="f" o:connecttype="none"/>
+                <o:lock v:ext="edit" shapetype="t"/>
+              </v:shapetype>
+              <v:shape id="Straight Arrow Connector 3" o:spid="_x0000_s1026" type="#_x0000_t32" style="position:absolute;margin-left:167.4pt;margin-top:13.05pt;width:33.6pt;height:18.6pt;z-index:251661312;visibility:visible;mso-wrap-style:square;mso-wrap-distance-left:9pt;mso-wrap-distance-top:0;mso-wrap-distance-right:9pt;mso-wrap-distance-bottom:0;mso-position-horizontal:absolute;mso-position-horizontal-relative:text;mso-position-vertical:absolute;mso-position-vertical-relative:text" o:gfxdata="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" strokecolor="#4579b8 [3044]">
+                <v:stroke endarrow="block"/>
+              </v:shape>
+            </w:pict>
+          </mc:Fallback>
+        </mc:AlternateContent>
+      </w:r>
+      <w:r>
+        <w:rPr>
+          <w:rFonts w:ascii="Arial" w:hAnsi="Arial" w:cs="Arial"/>
+          <w:b/>
+          <w:bCs/>
+          <w:noProof/>
+          <w:color w:val="000000"/>
+          <w:sz w:val="24"/>
+          <w:szCs w:val="24"/>
+        </w:rPr>
+        <mc:AlternateContent>
+          <mc:Choice Requires="wps">
+            <w:drawing>
+              <wp:anchor distT="0" distB="0" distL="114300" distR="114300" simplePos="0" relativeHeight="251659264" behindDoc="0" locked="0" layoutInCell="1" allowOverlap="1" wp14:anchorId="634F2C3E" wp14:editId="2F2EA799">
+                <wp:simplePos x="0" y="0"/>
+                <wp:positionH relativeFrom="column">
+                  <wp:posOffset>655320</wp:posOffset>
+                </wp:positionH>
+                <wp:positionV relativeFrom="paragraph">
+                  <wp:posOffset>188595</wp:posOffset>
+                </wp:positionV>
+                <wp:extent cx="624840" cy="266700"/>
+                <wp:effectExtent l="0" t="38100" r="60960" b="19050"/>
+                <wp:wrapNone/>
+                <wp:docPr id="820689482" name="Straight Arrow Connector 1"/>
+                <wp:cNvGraphicFramePr/>
+                <a:graphic xmlns:a="http://schemas.openxmlformats.org/drawingml/2006/main">
+                  <a:graphicData uri="http://schemas.microsoft.com/office/word/2010/wordprocessingShape">
+                    <wps:wsp>
+                      <wps:cNvCnPr/>
+                      <wps:spPr>
+                        <a:xfrm flipV="1">
+                          <a:off x="0" y="0"/>
+                          <a:ext cx="624840" cy="266700"/>
+                        </a:xfrm>
+                        <a:prstGeom prst="straightConnector1">
+                          <a:avLst/>
+                        </a:prstGeom>
+                        <a:ln>
+                          <a:tailEnd type="triangle"/>
+                        </a:ln>
+                      </wps:spPr>
+                      <wps:style>
+                        <a:lnRef idx="1">
+                          <a:schemeClr val="accent1"/>
+                        </a:lnRef>
+                        <a:fillRef idx="0">
+                          <a:schemeClr val="accent1"/>
+                        </a:fillRef>
+                        <a:effectRef idx="0">
+                          <a:schemeClr val="accent1"/>
+                        </a:effectRef>
+                        <a:fontRef idx="minor">
+                          <a:schemeClr val="tx1"/>
+                        </a:fontRef>
+                      </wps:style>
+                      <wps:bodyPr/>
+                    </wps:wsp>
+                  </a:graphicData>
+                </a:graphic>
+              </wp:anchor>
+            </w:drawing>
+          </mc:Choice>
+          <mc:Fallback>
+            <w:pict>
+              <v:shape w14:anchorId="1BB2609E" id="Straight Arrow Connector 1" o:spid="_x0000_s1026" type="#_x0000_t32" style="position:absolute;margin-left:51.6pt;margin-top:14.85pt;width:49.2pt;height:21pt;flip:y;z-index:251659264;visibility:visible;mso-wrap-style:square;mso-wrap-distance-left:9pt;mso-wrap-distance-top:0;mso-wrap-distance-right:9pt;mso-wrap-distance-bottom:0;mso-position-horizontal:absolute;mso-position-horizontal-relative:text;mso-position-vertical:absolute;mso-position-vertical-relative:text" o:gfxdata="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" strokecolor="#4579b8 [3044]">
+                <v:stroke endarrow="block"/>
+              </v:shape>
+            </w:pict>
+          </mc:Fallback>
+        </mc:AlternateContent>
+      </w:r>
+      <w:r>
+        <w:rPr>
+          <w:rFonts w:ascii="Arial" w:hAnsi="Arial" w:cs="Arial"/>
+          <w:b/>
+          <w:bCs/>
+          <w:color w:val="000000"/>
+          <w:sz w:val="24"/>
+          <w:szCs w:val="24"/>
+        </w:rPr>
+        <w:tab/>
+      </w:r>
+      <w:r>
+        <w:rPr>
+          <w:rFonts w:ascii="Arial" w:hAnsi="Arial" w:cs="Arial"/>
+          <w:b/>
+          <w:bCs/>
+          <w:color w:val="000000"/>
+          <w:sz w:val="24"/>
+          <w:szCs w:val="24"/>
+        </w:rPr>
+        <w:tab/>
+      </w:r>
+      <w:r>
+        <w:rPr>
+          <w:rFonts w:ascii="Arial" w:hAnsi="Arial" w:cs="Arial"/>
+          <w:b/>
+          <w:bCs/>
+          <w:color w:val="000000"/>
+          <w:sz w:val="24"/>
+          <w:szCs w:val="24"/>
+        </w:rPr>
+        <w:tab/>
+      </w:r>
+      <w:r>
+        <w:rPr>
+          <w:rFonts w:ascii="Arial" w:hAnsi="Arial" w:cs="Arial"/>
+          <w:b/>
+          <w:bCs/>
+          <w:color w:val="000000"/>
+          <w:sz w:val="24"/>
+          <w:szCs w:val="24"/>
+        </w:rPr>
+        <w:tab/>
+        <w:t>CANVOL</w:t>
+      </w:r>
     </w:p>
     <w:p>
       <w:pPr>
@@ -12757,6 +13111,145 @@
           <w:szCs w:val="24"/>
         </w:rPr>
       </w:pPr>
+      <w:r>
+        <w:rPr>
+          <w:rFonts w:ascii="Arial" w:hAnsi="Arial" w:cs="Arial"/>
+          <w:b/>
+          <w:bCs/>
+          <w:noProof/>
+          <w:color w:val="000000"/>
+          <w:sz w:val="24"/>
+          <w:szCs w:val="24"/>
+        </w:rPr>
+        <mc:AlternateContent>
+          <mc:Choice Requires="wps">
+            <w:drawing>
+              <wp:anchor distT="0" distB="0" distL="114300" distR="114300" simplePos="0" relativeHeight="251660288" behindDoc="0" locked="0" layoutInCell="1" allowOverlap="1" wp14:anchorId="5C20666F" wp14:editId="5769A343">
+                <wp:simplePos x="0" y="0"/>
+                <wp:positionH relativeFrom="column">
+                  <wp:posOffset>708660</wp:posOffset>
+                </wp:positionH>
+                <wp:positionV relativeFrom="paragraph">
+                  <wp:posOffset>121920</wp:posOffset>
+                </wp:positionV>
+                <wp:extent cx="1539240" cy="7620"/>
+                <wp:effectExtent l="0" t="76200" r="22860" b="87630"/>
+                <wp:wrapNone/>
+                <wp:docPr id="2061679887" name="Straight Arrow Connector 2"/>
+                <wp:cNvGraphicFramePr/>
+                <a:graphic xmlns:a="http://schemas.openxmlformats.org/drawingml/2006/main">
+                  <a:graphicData uri="http://schemas.microsoft.com/office/word/2010/wordprocessingShape">
+                    <wps:wsp>
+                      <wps:cNvCnPr/>
+                      <wps:spPr>
+                        <a:xfrm flipV="1">
+                          <a:off x="0" y="0"/>
+                          <a:ext cx="1539240" cy="7620"/>
+                        </a:xfrm>
+                        <a:prstGeom prst="straightConnector1">
+                          <a:avLst/>
+                        </a:prstGeom>
+                        <a:ln>
+                          <a:tailEnd type="triangle"/>
+                        </a:ln>
+                      </wps:spPr>
+                      <wps:style>
+                        <a:lnRef idx="1">
+                          <a:schemeClr val="accent1"/>
+                        </a:lnRef>
+                        <a:fillRef idx="0">
+                          <a:schemeClr val="accent1"/>
+                        </a:fillRef>
+                        <a:effectRef idx="0">
+                          <a:schemeClr val="accent1"/>
+                        </a:effectRef>
+                        <a:fontRef idx="minor">
+                          <a:schemeClr val="tx1"/>
+                        </a:fontRef>
+                      </wps:style>
+                      <wps:bodyPr/>
+                    </wps:wsp>
+                  </a:graphicData>
+                </a:graphic>
+              </wp:anchor>
+            </w:drawing>
+          </mc:Choice>
+          <mc:Fallback>
+            <w:pict>
+              <v:shape w14:anchorId="519E40ED" id="Straight Arrow Connector 2" o:spid="_x0000_s1026" type="#_x0000_t32" style="position:absolute;margin-left:55.8pt;margin-top:9.6pt;width:121.2pt;height:.6pt;flip:y;z-index:251660288;visibility:visible;mso-wrap-style:square;mso-wrap-distance-left:9pt;mso-wrap-distance-top:0;mso-wrap-distance-right:9pt;mso-wrap-distance-bottom:0;mso-position-horizontal:absolute;mso-position-horizontal-relative:text;mso-position-vertical:absolute;mso-position-vertical-relative:text" o:gfxdata="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" strokecolor="#4579b8 [3044]">
+                <v:stroke endarrow="block"/>
+              </v:shape>
+            </w:pict>
+          </mc:Fallback>
+        </mc:AlternateContent>
+      </w:r>
+      <w:r>
+        <w:rPr>
+          <w:rFonts w:ascii="Arial" w:hAnsi="Arial" w:cs="Arial"/>
+          <w:b/>
+          <w:bCs/>
+          <w:color w:val="000000"/>
+          <w:sz w:val="24"/>
+          <w:szCs w:val="24"/>
+        </w:rPr>
+        <w:t>CAPPEN</w:t>
+      </w:r>
+      <w:r>
+        <w:rPr>
+          <w:rFonts w:ascii="Arial" w:hAnsi="Arial" w:cs="Arial"/>
+          <w:b/>
+          <w:bCs/>
+          <w:color w:val="000000"/>
+          <w:sz w:val="24"/>
+          <w:szCs w:val="24"/>
+        </w:rPr>
+        <w:tab/>
+      </w:r>
+      <w:r>
+        <w:rPr>
+          <w:rFonts w:ascii="Arial" w:hAnsi="Arial" w:cs="Arial"/>
+          <w:b/>
+          <w:bCs/>
+          <w:color w:val="000000"/>
+          <w:sz w:val="24"/>
+          <w:szCs w:val="24"/>
+        </w:rPr>
+        <w:tab/>
+      </w:r>
+      <w:r>
+        <w:rPr>
+          <w:rFonts w:ascii="Arial" w:hAnsi="Arial" w:cs="Arial"/>
+          <w:b/>
+          <w:bCs/>
+          <w:color w:val="000000"/>
+          <w:sz w:val="24"/>
+          <w:szCs w:val="24"/>
+        </w:rPr>
+        <w:tab/>
+      </w:r>
+      <w:r>
+        <w:rPr>
+          <w:rFonts w:ascii="Arial" w:hAnsi="Arial" w:cs="Arial"/>
+          <w:b/>
+          <w:bCs/>
+          <w:color w:val="000000"/>
+          <w:sz w:val="24"/>
+          <w:szCs w:val="24"/>
+        </w:rPr>
+        <w:tab/>
+        <w:t>LOG</w:t>
+      </w:r>
+      <w:r>
+        <w:rPr>
+          <w:rFonts w:ascii="Arial" w:hAnsi="Arial" w:cs="Arial"/>
+          <w:b/>
+          <w:bCs/>
+          <w:color w:val="000000"/>
+          <w:sz w:val="24"/>
+          <w:szCs w:val="24"/>
+        </w:rPr>
+        <w:t>(PSA)</w:t>
+      </w:r>
     </w:p>
     <w:p>
       <w:pPr>
@@ -12897,25 +13390,6 @@
         <w:t>  </w:t>
       </w:r>
-    </w:p>
-    <w:p>
-      <w:pPr>
-        <w:widowControl w:val="0"/>
-        <w:tabs>
-          <w:tab w:val="left" w:pos="220"/>
-          <w:tab w:val="left" w:pos="720"/>
-        </w:tabs>
-        <w:autoSpaceDE w:val="0"/>
-        <w:autoSpaceDN w:val="0"/>
-        <w:adjustRightInd w:val="0"/>
-        <w:spacing w:after="293" w:line="340" w:lineRule="atLeast"/>
-        <w:rPr>
-          <w:rFonts w:ascii="Arial" w:eastAsia="MS Mincho" w:hAnsi="Arial" w:cs="Arial"/>
-          <w:color w:val="000000"/>
-          <w:sz w:val="24"/>
-          <w:szCs w:val="24"/>
-        </w:rPr>
-      </w:pPr>
     </w:p>
     <w:p>
       <w:pPr>
@@ -16067,12 +16541,39 @@
         <w:adjustRightInd w:val="0"/>
         <w:spacing w:after="293" w:line="340" w:lineRule="atLeast"/>
         <w:rPr>
-          <w:rFonts w:ascii="MS Mincho" w:eastAsia="MS Mincho" w:hAnsi="MS Mincho" w:cs="MS Mincho"/>
-          <w:color w:val="000000"/>
+          <w:rFonts w:ascii="Arial" w:eastAsia="MS Mincho" w:hAnsi="Arial" w:cs="Arial"/>
+          <w:color w:val="4F81BD" w:themeColor="accent1"/>
           <w:sz w:val="24"/>
           <w:szCs w:val="24"/>
         </w:rPr>
       </w:pPr>
+      <w:r>
+        <w:rPr>
+          <w:rFonts w:ascii="Arial" w:eastAsia="MS Mincho" w:hAnsi="Arial" w:cs="Arial"/>
+          <w:color w:val="4F81BD" w:themeColor="accent1"/>
+          <w:sz w:val="24"/>
+          <w:szCs w:val="24"/>
+        </w:rPr>
+        <w:t xml:space="preserve">Capsular penetration and cancer volume are </w:t>
+      </w:r>
+      <w:r>
+        <w:rPr>
+          <w:rFonts w:ascii="Arial" w:eastAsia="MS Mincho" w:hAnsi="Arial" w:cs="Arial"/>
+          <w:color w:val="4F81BD" w:themeColor="accent1"/>
+          <w:sz w:val="24"/>
+          <w:szCs w:val="24"/>
+        </w:rPr>
+        <w:t>good predictors for log(PSA) but when used together they share too much information</w:t>
+      </w:r>
+      <w:r>
+        <w:rPr>
+          <w:rFonts w:ascii="Arial" w:eastAsia="MS Mincho" w:hAnsi="Arial" w:cs="Arial"/>
+          <w:color w:val="4F81BD" w:themeColor="accent1"/>
+          <w:sz w:val="24"/>
+          <w:szCs w:val="24"/>
+        </w:rPr>
+        <w:t xml:space="preserve"> indicating collinearity.</w:t>
+      </w:r>
     </w:p>
     <w:p>
       <w:pPr>
@@ -16130,11 +16631,29 @@
       <w:pPr>
         <w:rPr>
           <w:rFonts w:ascii="Arial" w:hAnsi="Arial" w:cs="Arial"/>
-          <w:color w:val="000000"/>
+          <w:color w:val="4F81BD" w:themeColor="accent1"/>
           <w:sz w:val="24"/>
           <w:szCs w:val="24"/>
         </w:rPr>
       </w:pPr>
+      <w:r>
+        <w:rPr>
+          <w:rFonts w:ascii="Arial" w:hAnsi="Arial" w:cs="Arial"/>
+          <w:color w:val="4F81BD" w:themeColor="accent1"/>
+          <w:sz w:val="24"/>
+          <w:szCs w:val="24"/>
+        </w:rPr>
+        <w:t xml:space="preserve">It would make the most sense to include cancer volume since it has the highest association, unless there is some specific reason to use </w:t>
+      </w:r>
+      <w:r>
+        <w:rPr>
+          <w:rFonts w:ascii="Arial" w:hAnsi="Arial" w:cs="Arial"/>
+          <w:color w:val="4F81BD" w:themeColor="accent1"/>
+          <w:sz w:val="24"/>
+          <w:szCs w:val="24"/>
+        </w:rPr>
+        <w:t>capsular penetration instead. But it’s recommended to not use both.</w:t>
+      </w:r>
     </w:p>
     <w:sectPr>
       <w:headerReference w:type="even" r:id="rId11"/>
@@ -16184,6 +16703,7 @@
         <w:docPartUnique/>
       </w:docPartObj>
     </w:sdtPr>
+    <w:sdtEndPr/>
     <w:sdtContent>
       <w:p>
         <w:pPr>
@@ -16262,6 +16782,7 @@
         <w:temporary/>
         <w:showingPlcHdr/>
       </w:sdtPr>
+      <w:sdtEndPr/>
       <w:sdtContent>
         <w:r>
           <w:t>[Type text]</w:t>
@@ -16280,6 +16801,7 @@
         <w:temporary/>
         <w:showingPlcHdr/>
       </w:sdtPr>
+      <w:sdtEndPr/>
       <w:sdtContent>
         <w:r>
           <w:t>[Type text]</w:t>
@@ -16298,6 +16820,7 @@
         <w:temporary/>
         <w:showingPlcHdr/>
       </w:sdtPr>
+      <w:sdtEndPr/>
       <w:sdtContent>
         <w:r>
           <w:t>[Type text]</w:t>
@@ -17473,7 +17996,6 @@
   <w:style w:type="character" w:default="1" w:styleId="DefaultParagraphFont">
     <w:name w:val="Default Paragraph Font"/>
     <w:uiPriority w:val="1"/>
-    <w:semiHidden/>
     <w:unhideWhenUsed/>
   </w:style>
   <w:style w:type="table" w:default="1" w:styleId="TableNormal">
@@ -17855,6 +18377,7 @@
     <w:rsid w:val="00B8665A"/>
     <w:rsid w:val="00CB2B43"/>
     <w:rsid w:val="00D05AED"/>
+    <w:rsid w:val="00DE2231"/>
     <w:rsid w:val="00E563DC"/>
     <w:rsid w:val="00ED1E7E"/>
     <w:rsid w:val="00F03DBA"/>

</xml_diff>